<commit_message>
Belgelerden program yılı kaldırıldı: 52 docx + 52 PDF + ciktiveri.js
</commit_message>
<xml_diff>
--- a/dosyalar/bep/arapca-10-sinif-bep-plani.docx
+++ b/dosyalar/bep/arapca-10-sinif-bep-plani.docx
@@ -81,7 +81,7 @@
                 <w:sz w:val="18"/>
                 <w:szCs w:val="18"/>
               </w:rPr>
-              <w:t xml:space="preserve">2026-2027 · Arapça Dersi · 10. Sınıf · 2025 Arapça Dersi Öğretim Programı (9-10. sınıflar) · 3 saat/hafta · 111 saat</w:t>
+              <w:t xml:space="preserve">2026-2027 · Arapça Dersi · 10. Sınıf · Arapça Dersi Öğretim Programı (9-10. sınıflar) · 3 saat/hafta · 111 saat</w:t>
             </w:r>
           </w:p>
         </w:tc>
@@ -13271,7 +13271,7 @@
                 <w:sz w:val="17"/>
                 <w:szCs w:val="17"/>
               </w:rPr>
-              <w:t xml:space="preserve">Plan, 2025 Arapça Dersi Öğretim Programı (9-10. sınıflar) ve 2026-2027 ünitelendirilmiş yıllık planıyla (kidefarapca.com · Planlar kartı) uyumludur.</w:t>
+              <w:t xml:space="preserve">Plan, Arapça Dersi Öğretim Programı (9-10. sınıflar) ve 2026-2027 ünitelendirilmiş yıllık planıyla (kidefarapca.com · Planlar kartı) uyumludur.</w:t>
             </w:r>
           </w:p>
         </w:tc>

</xml_diff>